<commit_message>
Intègre les modifs de Julien + les vraies infos LinkedIn
Hero : « Basé dans le sud de la France », France · Québec, +20 ans,
600+ sites, « Homme orchestre ». Compétences : Créativité.

Contenu ancré sur le parcours réel (profil LinkedIn) :
- Récit refait : débuts 2003 en Provence (hôtel), e-commerce, affiliation,
  départ Québec 2014, montée jusqu'à VP Web Strategy, retour dans le Sud
- Frise réécrite avec vraies étapes/dates (Valmouriane, Charles & Alice,
  Relaxr, iMasterWeb, Haladjian, Québec 2014→, VP 2022)
- Expertise 05/06 confirmées (affiliation depuis 2010, VP)
- Chiffres : 600+ sites, +20 ans, M+ visiteurs/jour
- Perso amorcé avec du vrai : champion de Provence de full-contact,
  Trophélia, BAFA
- Histoire : Avignon → Québec → retour en Provence
- JSON-LD : poste et localisation actualisés

Régénère aussi l'export Word (v2) aligné sur ce contenu.

Co-Authored-By: Claude Opus 4.8 <noreply@anthropic.com>
Claude-Session: https://claude.ai/code/session_014H9rUNgBCP78wS1hm3XgYH
</commit_message>
<xml_diff>
--- a/textes-julienguiss.docx
+++ b/textes-julienguiss.docx
@@ -27,7 +27,7 @@
           <w:sz w:val="26"/>
           <w:szCs w:val="26"/>
         </w:rPr>
-        <w:t xml:space="preserve">Tous les textes du site — à retravailler</w:t>
+        <w:t xml:space="preserve">Tous les textes du site — v2 (infos LinkedIn intégrées)</w:t>
       </w:r>
     </w:p>
     <w:p>
@@ -40,7 +40,7 @@
           <w:iCs/>
           <w:color w:val="666666"/>
         </w:rPr>
-        <w:t xml:space="preserve">Ce document reprend l'intégralité des textes visibles du site, section par section, dans l'ordre d'apparition. Modifie librement : je réintègre ensuite tes versions dans le site. Les passages en rouge marqués [entre crochets] sont les éléments à confirmer ou compléter (dates, poste, faits personnels).</w:t>
+        <w:t xml:space="preserve">Cette version reprend tes modifs (sud de la France, 600+, « Homme orchestre »…) ET les vraies infos de ton profil LinkedIn (postes, dates, parcours). Modifie librement, je réintègre. En rouge [entre crochets] = ce qui reste à confirmer/compléter, surtout le volet perso et le récit.</w:t>
       </w:r>
     </w:p>
     <w:p>
@@ -82,7 +82,7 @@
         <w:t xml:space="preserve">Badge : </w:t>
       </w:r>
       <w:r>
-        <w:t xml:space="preserve">Basé à Québec · dispo pour échanger</w:t>
+        <w:t xml:space="preserve">Basé dans le sud de la France</w:t>
       </w:r>
     </w:p>
     <w:p>
@@ -114,7 +114,7 @@
         <w:t xml:space="preserve">Ligne d'intro (centre) : </w:t>
       </w:r>
       <w:r>
-        <w:t xml:space="preserve">Avignon → Québec</w:t>
+        <w:t xml:space="preserve">France · Québec</w:t>
       </w:r>
     </w:p>
     <w:p>
@@ -162,7 +162,7 @@
         <w:t xml:space="preserve">Chiffre 1 : </w:t>
       </w:r>
       <w:r>
-        <w:t xml:space="preserve">20 ans de web</w:t>
+        <w:t xml:space="preserve">+20 ans de web</w:t>
       </w:r>
     </w:p>
     <w:p>
@@ -178,7 +178,7 @@
         <w:t xml:space="preserve">Chiffre 2 : </w:t>
       </w:r>
       <w:r>
-        <w:t xml:space="preserve">300+ sites livrés</w:t>
+        <w:t xml:space="preserve">600+ sites livrés</w:t>
       </w:r>
     </w:p>
     <w:p>
@@ -210,7 +210,7 @@
         <w:t xml:space="preserve">Chiffre 4 : </w:t>
       </w:r>
       <w:r>
-        <w:t xml:space="preserve">QC ← FR</w:t>
+        <w:t xml:space="preserve">Homme orchestre</w:t>
       </w:r>
     </w:p>
     <w:p>
@@ -243,7 +243,7 @@
         <w:spacing w:after="140"/>
       </w:pPr>
       <w:r>
-        <w:t xml:space="preserve">SEO · Analytics · Affiliation · Stratégie web · Search Console · Performance</w:t>
+        <w:t xml:space="preserve">SEO · Analytics · Affiliation · Stratégie web · Créativité · Performance</w:t>
       </w:r>
     </w:p>
     <w:p>
@@ -284,7 +284,7 @@
         <w:t xml:space="preserve">Titre : </w:t>
       </w:r>
       <w:r>
-        <w:t xml:space="preserve">Ce que je sais faire</w:t>
+        <w:t xml:space="preserve">Ce que je fais</w:t>
       </w:r>
     </w:p>
     <w:p>
@@ -394,15 +394,7 @@
         <w:spacing w:after="140"/>
       </w:pPr>
       <w:r>
-        <w:t xml:space="preserve">Transformer le trafic en modèle économique. Vingt ans à en vivre. </w:t>
-      </w:r>
-      <w:r>
-        <w:rPr>
-          <w:b/>
-          <w:bCs/>
-          <w:color w:val="C0392B"/>
-        </w:rPr>
-        <w:t xml:space="preserve">[à confirmer]</w:t>
+        <w:t xml:space="preserve">Transformer le trafic en modèle économique. Entrepreneur en affiliation depuis 2010.</w:t>
       </w:r>
     </w:p>
     <w:p>
@@ -424,15 +416,7 @@
         <w:spacing w:after="140"/>
       </w:pPr>
       <w:r>
-        <w:t xml:space="preserve">Piloter l'acquisition à l'échelle, aligner les équipes sur un cap. </w:t>
-      </w:r>
-      <w:r>
-        <w:rPr>
-          <w:b/>
-          <w:bCs/>
-          <w:color w:val="C0392B"/>
-        </w:rPr>
-        <w:t xml:space="preserve">[à confirmer]</w:t>
+        <w:t xml:space="preserve">Piloter SEO, contenu, UX et monétisation à l'échelle. Aujourd'hui Vice-Président, Web Strategy.</w:t>
       </w:r>
     </w:p>
     <w:p>
@@ -495,45 +479,23 @@
         <w:spacing w:after="140"/>
       </w:pPr>
       <w:r>
-        <w:t xml:space="preserve">Je n'ai pas appris le web à l'école. En 2003, on l'apprenait la nuit — en regardant le code source des autres, en cassant des trucs, en recommençant.</w:t>
-      </w:r>
-    </w:p>
-    <w:p>
-      <w:pPr>
-        <w:spacing w:after="140"/>
-      </w:pPr>
-      <w:r>
-        <w:t xml:space="preserve">Très vite, une question m'a obsédé : pourquoi ce site-là arrive avant le mien ? C'est comme ça que je suis tombé dans le SEO, avant même de savoir que ça portait un nom.</w:t>
-      </w:r>
-    </w:p>
-    <w:p>
-      <w:pPr>
-        <w:spacing w:after="140"/>
-      </w:pPr>
-      <w:r>
-        <w:t xml:space="preserve">Pendant vingt ans, la même chose en plus grand : plus de 300 sites </w:t>
-      </w:r>
-      <w:r>
-        <w:rPr>
-          <w:b/>
-          <w:bCs/>
-          <w:color w:val="C0392B"/>
-        </w:rPr>
-        <w:t xml:space="preserve">[à confirmer]</w:t>
-      </w:r>
-      <w:r>
-        <w:t xml:space="preserve">, de l'affiliation, des refontes, des audits, des équipes. Et un jour, mes valises : d'Avignon à Québec </w:t>
-      </w:r>
-      <w:r>
-        <w:rPr>
-          <w:b/>
-          <w:bCs/>
-          <w:color w:val="C0392B"/>
-        </w:rPr>
-        <w:t xml:space="preserve">[à confirmer]</w:t>
-      </w:r>
-      <w:r>
-        <w:t xml:space="preserve">. Mais dans ma tête, je suis resté le gamin de 2003.</w:t>
+        <w:t xml:space="preserve">Je n'ai pas appris le web à l'école. En 2003, en Provence, je m'occupe du marketing et du site d'un hôtel — et je découvre ce truc immense, branché au monde entier. Je n'en suis jamais vraiment ressorti.</w:t>
+      </w:r>
+    </w:p>
+    <w:p>
+      <w:pPr>
+        <w:spacing w:after="140"/>
+      </w:pPr>
+      <w:r>
+        <w:t xml:space="preserve">Une question m'obsède : pourquoi ce site-là arrive avant le mien ? De boutique e-commerce en boutique e-commerce, je tombe dans le SEO puis dans l'affiliation — au point d'en faire mon métier, puis ma propre affaire.</w:t>
+      </w:r>
+    </w:p>
+    <w:p>
+      <w:pPr>
+        <w:spacing w:after="140"/>
+      </w:pPr>
+      <w:r>
+        <w:t xml:space="preserve">En 2014, je fais mes valises pour le Québec. En huit ans, je passe de SEO Manager à Vice-Président, Web Strategy Services — des centaines de sites, des millions de visiteurs par jour. Aujourd'hui, de retour dans le sud de la France, je pilote toujours cette stratégie à distance. Mais dans ma tête, je suis resté le gamin de 2003.</w:t>
       </w:r>
     </w:p>
     <w:p>
@@ -547,7 +509,7 @@
           <w:sz w:val="24"/>
           <w:szCs w:val="24"/>
         </w:rPr>
-        <w:t xml:space="preserve">Frise chronologique</w:t>
+        <w:t xml:space="preserve">Frise chronologique (d'après ton LinkedIn — à ajuster)</w:t>
       </w:r>
     </w:p>
     <w:p>
@@ -567,7 +529,7 @@
           <w:b/>
           <w:bCs/>
         </w:rPr>
-        <w:t xml:space="preserve">Le premier site</w:t>
+        <w:t xml:space="preserve">Les débuts, en Provence</w:t>
       </w:r>
     </w:p>
     <w:p>
@@ -575,7 +537,147 @@
         <w:spacing w:after="120"/>
       </w:pPr>
       <w:r>
-        <w:t xml:space="preserve">Premières lignes de HTML, premier « ça marche ! ». Le déclic. </w:t>
+        <w:t xml:space="preserve">Marketing et web pour un hôtel **** à Saint-Rémy (Domaine de Valmouriane). Le web entre dans ma vie.</w:t>
+      </w:r>
+    </w:p>
+    <w:p>
+      <w:pPr>
+        <w:spacing w:after="40"/>
+      </w:pPr>
+      <w:r>
+        <w:rPr>
+          <w:b/>
+          <w:bCs/>
+          <w:color w:val="2B2BFF"/>
+        </w:rPr>
+        <w:t xml:space="preserve">2005 — </w:t>
+      </w:r>
+      <w:r>
+        <w:rPr>
+          <w:b/>
+          <w:bCs/>
+        </w:rPr>
+        <w:t xml:space="preserve">Webmaster e-commerce</w:t>
+      </w:r>
+    </w:p>
+    <w:p>
+      <w:pPr>
+        <w:spacing w:after="120"/>
+      </w:pPr>
+      <w:r>
+        <w:t xml:space="preserve">Charles &amp; Alice : je code des boutiques (osCommerce) et j'utilise le SEO pour doper le ROI.</w:t>
+      </w:r>
+    </w:p>
+    <w:p>
+      <w:pPr>
+        <w:spacing w:after="40"/>
+      </w:pPr>
+      <w:r>
+        <w:rPr>
+          <w:b/>
+          <w:bCs/>
+          <w:color w:val="2B2BFF"/>
+        </w:rPr>
+        <w:t xml:space="preserve">2008 — </w:t>
+      </w:r>
+      <w:r>
+        <w:rPr>
+          <w:b/>
+          <w:bCs/>
+        </w:rPr>
+        <w:t xml:space="preserve">E-commerce à plein temps</w:t>
+      </w:r>
+    </w:p>
+    <w:p>
+      <w:pPr>
+        <w:spacing w:after="120"/>
+      </w:pPr>
+      <w:r>
+        <w:t xml:space="preserve">Relaxr System : Magento, PPC, SEO, email. Senior Manager e-commerce.</w:t>
+      </w:r>
+    </w:p>
+    <w:p>
+      <w:pPr>
+        <w:spacing w:after="40"/>
+      </w:pPr>
+      <w:r>
+        <w:rPr>
+          <w:b/>
+          <w:bCs/>
+          <w:color w:val="2B2BFF"/>
+        </w:rPr>
+        <w:t xml:space="preserve">2010 — </w:t>
+      </w:r>
+      <w:r>
+        <w:rPr>
+          <w:b/>
+          <w:bCs/>
+        </w:rPr>
+        <w:t xml:space="preserve">iMasterWeb — à mon compte</w:t>
+      </w:r>
+    </w:p>
+    <w:p>
+      <w:pPr>
+        <w:spacing w:after="120"/>
+      </w:pPr>
+      <w:r>
+        <w:t xml:space="preserve">Entrepreneur : SEM &amp; affiliation. (toujours actif)</w:t>
+      </w:r>
+    </w:p>
+    <w:p>
+      <w:pPr>
+        <w:spacing w:after="40"/>
+      </w:pPr>
+      <w:r>
+        <w:rPr>
+          <w:b/>
+          <w:bCs/>
+          <w:color w:val="2B2BFF"/>
+        </w:rPr>
+        <w:t xml:space="preserve">2011 — </w:t>
+      </w:r>
+      <w:r>
+        <w:rPr>
+          <w:b/>
+          <w:bCs/>
+        </w:rPr>
+        <w:t xml:space="preserve">Traffic Manager</w:t>
+      </w:r>
+    </w:p>
+    <w:p>
+      <w:pPr>
+        <w:spacing w:after="120"/>
+      </w:pPr>
+      <w:r>
+        <w:t xml:space="preserve">Haladjian : lancer un réseau de sites, AdWords &amp; Bing, social.</w:t>
+      </w:r>
+    </w:p>
+    <w:p>
+      <w:pPr>
+        <w:spacing w:after="40"/>
+      </w:pPr>
+      <w:r>
+        <w:rPr>
+          <w:b/>
+          <w:bCs/>
+          <w:color w:val="2B2BFF"/>
+        </w:rPr>
+        <w:t xml:space="preserve">2014 — </w:t>
+      </w:r>
+      <w:r>
+        <w:rPr>
+          <w:b/>
+          <w:bCs/>
+        </w:rPr>
+        <w:t xml:space="preserve">Le grand saut au Québec</w:t>
+      </w:r>
+    </w:p>
+    <w:p>
+      <w:pPr>
+        <w:spacing w:after="120"/>
+      </w:pPr>
+      <w:r>
+        <w:t xml:space="preserve">Cap sur Québec : SEO Manager, puis SEO Director en 2015. </w:t>
       </w:r>
       <w:r>
         <w:rPr>
@@ -583,7 +685,7 @@
           <w:bCs/>
           <w:color w:val="C0392B"/>
         </w:rPr>
-        <w:t xml:space="preserve">[à confirmer]</w:t>
+        <w:t xml:space="preserve">[entreprise : CrakRevenue — à confirmer si tu veux la citer]</w:t>
       </w:r>
     </w:p>
     <w:p>
@@ -596,14 +698,14 @@
           <w:bCs/>
           <w:color w:val="2B2BFF"/>
         </w:rPr>
-        <w:t xml:space="preserve">~2005 — </w:t>
-      </w:r>
-      <w:r>
-        <w:rPr>
-          <w:b/>
-          <w:bCs/>
-        </w:rPr>
-        <w:t xml:space="preserve">Le déclic SEO</w:t>
+        <w:t xml:space="preserve">2017 — </w:t>
+      </w:r>
+      <w:r>
+        <w:rPr>
+          <w:b/>
+          <w:bCs/>
+        </w:rPr>
+        <w:t xml:space="preserve">Strategic Acquisition Director</w:t>
       </w:r>
     </w:p>
     <w:p>
@@ -611,15 +713,7 @@
         <w:spacing w:after="120"/>
       </w:pPr>
       <w:r>
-        <w:t xml:space="preserve">« Pourquoi lui passe avant moi ? » L'obsession du classement. </w:t>
-      </w:r>
-      <w:r>
-        <w:rPr>
-          <w:b/>
-          <w:bCs/>
-          <w:color w:val="C0392B"/>
-        </w:rPr>
-        <w:t xml:space="preserve">[à confirmer]</w:t>
+        <w:t xml:space="preserve">Un réseau de 300+ sites, campagnes à fort volume, plugins WordPress d'affiliation.</w:t>
       </w:r>
     </w:p>
     <w:p>
@@ -632,14 +726,14 @@
           <w:bCs/>
           <w:color w:val="2B2BFF"/>
         </w:rPr>
-        <w:t xml:space="preserve">~2008 — </w:t>
-      </w:r>
-      <w:r>
-        <w:rPr>
-          <w:b/>
-          <w:bCs/>
-        </w:rPr>
-        <w:t xml:space="preserve">L'affiliation</w:t>
+        <w:t xml:space="preserve">2022 — </w:t>
+      </w:r>
+      <w:r>
+        <w:rPr>
+          <w:b/>
+          <w:bCs/>
+        </w:rPr>
+        <w:t xml:space="preserve">Vice-Président, Web Strategy Services</w:t>
       </w:r>
     </w:p>
     <w:p>
@@ -647,123 +741,7 @@
         <w:spacing w:after="120"/>
       </w:pPr>
       <w:r>
-        <w:t xml:space="preserve">Le web devient un métier, puis un modèle. </w:t>
-      </w:r>
-      <w:r>
-        <w:rPr>
-          <w:b/>
-          <w:bCs/>
-          <w:color w:val="C0392B"/>
-        </w:rPr>
-        <w:t xml:space="preserve">[à confirmer]</w:t>
-      </w:r>
-    </w:p>
-    <w:p>
-      <w:pPr>
-        <w:spacing w:after="40"/>
-      </w:pPr>
-      <w:r>
-        <w:rPr>
-          <w:b/>
-          <w:bCs/>
-          <w:color w:val="2B2BFF"/>
-        </w:rPr>
-        <w:t xml:space="preserve">2010s — </w:t>
-      </w:r>
-      <w:r>
-        <w:rPr>
-          <w:b/>
-          <w:bCs/>
-        </w:rPr>
-        <w:t xml:space="preserve">300+ sites</w:t>
-      </w:r>
-    </w:p>
-    <w:p>
-      <w:pPr>
-        <w:spacing w:after="120"/>
-      </w:pPr>
-      <w:r>
-        <w:t xml:space="preserve">L'artisanat passe à l'échelle. </w:t>
-      </w:r>
-      <w:r>
-        <w:rPr>
-          <w:b/>
-          <w:bCs/>
-          <w:color w:val="C0392B"/>
-        </w:rPr>
-        <w:t xml:space="preserve">[à confirmer]</w:t>
-      </w:r>
-    </w:p>
-    <w:p>
-      <w:pPr>
-        <w:spacing w:after="40"/>
-      </w:pPr>
-      <w:r>
-        <w:rPr>
-          <w:b/>
-          <w:bCs/>
-          <w:color w:val="2B2BFF"/>
-        </w:rPr>
-        <w:t xml:space="preserve">Québec — </w:t>
-      </w:r>
-      <w:r>
-        <w:rPr>
-          <w:b/>
-          <w:bCs/>
-        </w:rPr>
-        <w:t xml:space="preserve">Avignon → Québec</w:t>
-      </w:r>
-    </w:p>
-    <w:p>
-      <w:pPr>
-        <w:spacing w:after="120"/>
-      </w:pPr>
-      <w:r>
-        <w:t xml:space="preserve">Le grand saut vers l'hiver québécois. </w:t>
-      </w:r>
-      <w:r>
-        <w:rPr>
-          <w:b/>
-          <w:bCs/>
-          <w:color w:val="C0392B"/>
-        </w:rPr>
-        <w:t xml:space="preserve">[à confirmer]</w:t>
-      </w:r>
-    </w:p>
-    <w:p>
-      <w:pPr>
-        <w:spacing w:after="40"/>
-      </w:pPr>
-      <w:r>
-        <w:rPr>
-          <w:b/>
-          <w:bCs/>
-          <w:color w:val="2B2BFF"/>
-        </w:rPr>
-        <w:t xml:space="preserve">Auj. — </w:t>
-      </w:r>
-      <w:r>
-        <w:rPr>
-          <w:b/>
-          <w:bCs/>
-        </w:rPr>
-        <w:t xml:space="preserve">Stratégie web</w:t>
-      </w:r>
-    </w:p>
-    <w:p>
-      <w:pPr>
-        <w:spacing w:after="120"/>
-      </w:pPr>
-      <w:r>
-        <w:t xml:space="preserve">Piloter l'acquisition à l'échelle. </w:t>
-      </w:r>
-      <w:r>
-        <w:rPr>
-          <w:b/>
-          <w:bCs/>
-          <w:color w:val="C0392B"/>
-        </w:rPr>
-        <w:t xml:space="preserve">[à confirmer]</w:t>
+        <w:t xml:space="preserve">SEO, contenu, UX, monétisation à l'échelle. Aujourd'hui, de retour dans le Sud.</w:t>
       </w:r>
     </w:p>
     <w:p>
@@ -810,7 +788,7 @@
           <w:iCs/>
           <w:color w:val="666666"/>
         </w:rPr>
-        <w:t xml:space="preserve">Liste d'outils à ajuster selon ceux que tu utilises vraiment.</w:t>
+        <w:t xml:space="preserve">À ajuster selon les outils que tu utilises vraiment.</w:t>
       </w:r>
     </w:p>
     <w:p>
@@ -881,7 +859,7 @@
           <w:bCs/>
           <w:color w:val="666666"/>
         </w:rPr>
-        <w:t xml:space="preserve">300+ : </w:t>
+        <w:t xml:space="preserve">600+ : </w:t>
       </w:r>
       <w:r>
         <w:t xml:space="preserve">sites livrés</w:t>
@@ -897,26 +875,26 @@
           <w:bCs/>
           <w:color w:val="666666"/>
         </w:rPr>
-        <w:t xml:space="preserve">20 : </w:t>
-      </w:r>
-      <w:r>
-        <w:t xml:space="preserve">ans de web</w:t>
-      </w:r>
-    </w:p>
-    <w:p>
-      <w:pPr>
-        <w:spacing w:after="80"/>
-      </w:pPr>
-      <w:r>
-        <w:rPr>
-          <w:b/>
-          <w:bCs/>
-          <w:color w:val="666666"/>
-        </w:rPr>
-        <w:t xml:space="preserve">1 : </w:t>
-      </w:r>
-      <w:r>
-        <w:t xml:space="preserve">aller simple FR → QC</w:t>
+        <w:t xml:space="preserve">20 ans : </w:t>
+      </w:r>
+      <w:r>
+        <w:t xml:space="preserve">de web</w:t>
+      </w:r>
+    </w:p>
+    <w:p>
+      <w:pPr>
+        <w:spacing w:after="80"/>
+      </w:pPr>
+      <w:r>
+        <w:rPr>
+          <w:b/>
+          <w:bCs/>
+          <w:color w:val="666666"/>
+        </w:rPr>
+        <w:t xml:space="preserve">M+ : </w:t>
+      </w:r>
+      <w:r>
+        <w:t xml:space="preserve">visiteurs / jour</w:t>
       </w:r>
     </w:p>
     <w:p>
@@ -987,15 +965,15 @@
           <w:sz w:val="24"/>
           <w:szCs w:val="24"/>
         </w:rPr>
-        <w:t xml:space="preserve">🌞 Le Sud dans le sang</w:t>
-      </w:r>
-    </w:p>
-    <w:p>
-      <w:pPr>
-        <w:spacing w:after="140"/>
-      </w:pPr>
-      <w:r>
-        <w:t xml:space="preserve">Avignon, la lumière, l'accent, les étés interminables. </w:t>
+        <w:t xml:space="preserve">🥊 Champion de Provence de full-contact</w:t>
+      </w:r>
+    </w:p>
+    <w:p>
+      <w:pPr>
+        <w:spacing w:after="140"/>
+      </w:pPr>
+      <w:r>
+        <w:t xml:space="preserve">La discipline, l'énergie, le goût de l'effort. </w:t>
       </w:r>
       <w:r>
         <w:rPr>
@@ -1017,23 +995,15 @@
           <w:sz w:val="24"/>
           <w:szCs w:val="24"/>
         </w:rPr>
-        <w:t xml:space="preserve">❄️ L'hiver québécois</w:t>
-      </w:r>
-    </w:p>
-    <w:p>
-      <w:pPr>
-        <w:spacing w:after="140"/>
-      </w:pPr>
-      <w:r>
-        <w:t xml:space="preserve">Le grand froid, la neige, une autre façon de vivre. </w:t>
-      </w:r>
-      <w:r>
-        <w:rPr>
-          <w:b/>
-          <w:bCs/>
-          <w:color w:val="C0392B"/>
-        </w:rPr>
-        <w:t xml:space="preserve">[à confirmer]</w:t>
+        <w:t xml:space="preserve">🌞 Le Sud dans le sang</w:t>
+      </w:r>
+    </w:p>
+    <w:p>
+      <w:pPr>
+        <w:spacing w:after="140"/>
+      </w:pPr>
+      <w:r>
+        <w:t xml:space="preserve">Avignon, la lumière, l'accent, les étés interminables.</w:t>
       </w:r>
     </w:p>
     <w:p>
@@ -1047,15 +1017,15 @@
           <w:sz w:val="24"/>
           <w:szCs w:val="24"/>
         </w:rPr>
-        <w:t xml:space="preserve">👨‍👩‍👧 La famille</w:t>
-      </w:r>
-    </w:p>
-    <w:p>
-      <w:pPr>
-        <w:spacing w:after="140"/>
-      </w:pPr>
-      <w:r>
-        <w:t xml:space="preserve">Ce qui compte quand l'ordinateur est éteint. </w:t>
+        <w:t xml:space="preserve">🏆 Une autre vie : l'agroalimentaire</w:t>
+      </w:r>
+    </w:p>
+    <w:p>
+      <w:pPr>
+        <w:spacing w:after="140"/>
+      </w:pPr>
+      <w:r>
+        <w:t xml:space="preserve">Vainqueur du Trophélia, l'innovation fruits &amp; légumes. </w:t>
       </w:r>
       <w:r>
         <w:rPr>
@@ -1077,15 +1047,15 @@
           <w:sz w:val="24"/>
           <w:szCs w:val="24"/>
         </w:rPr>
-        <w:t xml:space="preserve">🎬 Passions</w:t>
-      </w:r>
-    </w:p>
-    <w:p>
-      <w:pPr>
-        <w:spacing w:after="140"/>
-      </w:pPr>
-      <w:r>
-        <w:t xml:space="preserve">Ce que tu me raconteras : ce que tu aimes, ce qui t'anime. </w:t>
+        <w:t xml:space="preserve">🏕️ Transmettre</w:t>
+      </w:r>
+    </w:p>
+    <w:p>
+      <w:pPr>
+        <w:spacing w:after="140"/>
+      </w:pPr>
+      <w:r>
+        <w:t xml:space="preserve">BAFA, encadrer, animer — depuis longtemps. </w:t>
       </w:r>
       <w:r>
         <w:rPr>
@@ -1151,15 +1121,15 @@
         <w:t xml:space="preserve">Titre : </w:t>
       </w:r>
       <w:r>
-        <w:t xml:space="preserve">D'Avignon à Québec</w:t>
-      </w:r>
-    </w:p>
-    <w:p>
-      <w:pPr>
-        <w:spacing w:after="140"/>
-      </w:pPr>
-      <w:r>
-        <w:t xml:space="preserve">Une trajectoire qui traverse un océan. Le récit complet viendra ici — pour l'instant, la carte du voyage. </w:t>
+        <w:t xml:space="preserve">D'Avignon à Québec, et retour</w:t>
+      </w:r>
+    </w:p>
+    <w:p>
+      <w:pPr>
+        <w:spacing w:after="140"/>
+      </w:pPr>
+      <w:r>
+        <w:t xml:space="preserve">Une trajectoire qui traverse un océan — puis le retraverse. Le récit complet viendra ici ; pour l'instant, la carte du voyage. </w:t>
       </w:r>
       <w:r>
         <w:rPr>
@@ -1197,7 +1167,7 @@
         <w:t xml:space="preserve">Étape 1 : </w:t>
       </w:r>
       <w:r>
-        <w:t xml:space="preserve">Avignon — France · origine</w:t>
+        <w:t xml:space="preserve">Avignon — Provence · origine</w:t>
       </w:r>
     </w:p>
     <w:p>
@@ -1229,15 +1199,7 @@
         <w:t xml:space="preserve">Étape 3 : </w:t>
       </w:r>
       <w:r>
-        <w:t xml:space="preserve">La traversée — </w:t>
-      </w:r>
-      <w:r>
-        <w:rPr>
-          <w:b/>
-          <w:bCs/>
-          <w:color w:val="C0392B"/>
-        </w:rPr>
-        <w:t xml:space="preserve">[année ?]</w:t>
+        <w:t xml:space="preserve">Québec — 2014 – 2022</w:t>
       </w:r>
     </w:p>
     <w:p>
@@ -1253,7 +1215,7 @@
         <w:t xml:space="preserve">Étape 4 : </w:t>
       </w:r>
       <w:r>
-        <w:t xml:space="preserve">Québec — Canada · aujourd'hui</w:t>
+        <w:t xml:space="preserve">Le Sud — retour · aujourd'hui</w:t>
       </w:r>
     </w:p>
     <w:p>
@@ -1283,7 +1245,7 @@
         <w:spacing w:after="140"/>
       </w:pPr>
       <w:r>
-        <w:t xml:space="preserve">Itinéraire : Avignon, France → Québec, Canada</w:t>
+        <w:t xml:space="preserve">Itinéraire : Avignon → Québec → Provence</w:t>
       </w:r>
     </w:p>
     <w:p>
@@ -1293,38 +1255,6 @@
       </w:pPr>
       <w:r>
         <w:t xml:space="preserve">Contact</w:t>
-      </w:r>
-    </w:p>
-    <w:p>
-      <w:pPr>
-        <w:spacing w:after="80"/>
-      </w:pPr>
-      <w:r>
-        <w:rPr>
-          <w:b/>
-          <w:bCs/>
-          <w:color w:val="666666"/>
-        </w:rPr>
-        <w:t xml:space="preserve">Sur-titre : </w:t>
-      </w:r>
-      <w:r>
-        <w:t xml:space="preserve">Contact</w:t>
-      </w:r>
-    </w:p>
-    <w:p>
-      <w:pPr>
-        <w:spacing w:after="80"/>
-      </w:pPr>
-      <w:r>
-        <w:rPr>
-          <w:b/>
-          <w:bCs/>
-          <w:color w:val="666666"/>
-        </w:rPr>
-        <w:t xml:space="preserve">Titre : </w:t>
-      </w:r>
-      <w:r>
-        <w:t xml:space="preserve">On se dit bonjour ?</w:t>
       </w:r>
     </w:p>
     <w:p>

</xml_diff>